<commit_message>
Changes make to Skill section
</commit_message>
<xml_diff>
--- a/Skill/Week 2/Task 2.1.docx
+++ b/Skill/Week 2/Task 2.1.docx
@@ -16,21 +16,7 @@
           <w:bCs w:val="1"/>
           <w:rtl w:val="0"/>
         </w:rPr>
-        <w:t xml:space="preserve">Develop a C program that uses the system calls open(), read(), write(), and close() to copy the contents of one file to another. Explain how control transitions between user space and kernel space during execution.</w:t>
-      </w:r>
-    </w:p>
-    <w:p>
-      <w:pPr>
-        <w:jc w:val="both"/>
-        <w:rPr>
-          <w:b w:val="1"/>
-          <w:bCs w:val="1"/>
-        </w:rPr>
-      </w:pPr>
-      <w:r>
-        <w:rPr>
-          <w:rtl w:val="0"/>
-        </w:rPr>
+        <w:t xml:space="preserve">To Apply Escape Sequences, Store Command History, Navigate Previous Commands, Navigate Next Commands, Update Input Buffer, Test Recall Functionality </w:t>
       </w:r>
     </w:p>
     <w:p>
@@ -62,20 +48,6 @@
           <w:rtl w:val="0"/>
         </w:rPr>
         <w:t xml:space="preserve">Code:</w:t>
-      </w:r>
-    </w:p>
-    <w:p>
-      <w:pPr>
-        <w:jc w:val="both"/>
-        <w:rPr>
-          <w:b w:val="1"/>
-          <w:bCs w:val="1"/>
-        </w:rPr>
-      </w:pPr>
-      <w:r>
-        <w:rPr>
-          <w:rtl w:val="0"/>
-        </w:rPr>
       </w:r>
     </w:p>
     <w:p>
@@ -93,14 +65,14 @@
         </w:rPr>
         <w:drawing>
           <wp:inline distB="114300" distT="114300" distL="114300" distR="114300">
-            <wp:extent cx="5103590" cy="4316062"/>
+            <wp:extent cx="4876800" cy="5210175"/>
             <wp:effectExtent b="0" l="0" r="0" t="0"/>
-            <wp:docPr id="2" name="image2.png"/>
+            <wp:docPr id="1" name="image1.png"/>
             <a:graphic>
               <a:graphicData uri="http://schemas.openxmlformats.org/drawingml/2006/picture">
                 <pic:pic>
                   <pic:nvPicPr>
-                    <pic:cNvPr id="0" name="image2.png"/>
+                    <pic:cNvPr id="0" name="image1.png"/>
                     <pic:cNvPicPr preferRelativeResize="0"/>
                   </pic:nvPicPr>
                   <pic:blipFill>
@@ -113,7 +85,7 @@
                   <pic:spPr>
                     <a:xfrm>
                       <a:off x="0" y="0"/>
-                      <a:ext cx="5103590" cy="4316062"/>
+                      <a:ext cx="4876800" cy="5210175"/>
                     </a:xfrm>
                     <a:prstGeom prst="rect"/>
                     <a:ln/>
@@ -154,25 +126,25 @@
       </w:pPr>
       <w:r>
         <w:rPr>
-          <w:rtl w:val="0"/>
-        </w:rPr>
-      </w:r>
-    </w:p>
-    <w:p>
-      <w:pPr>
-        <w:jc w:val="both"/>
-        <w:rPr>
-          <w:b w:val="1"/>
-          <w:bCs w:val="1"/>
-        </w:rPr>
-      </w:pPr>
-      <w:r>
-        <w:rPr>
           <w:b w:val="1"/>
           <w:bCs w:val="1"/>
           <w:rtl w:val="0"/>
         </w:rPr>
         <w:t xml:space="preserve">Output: </w:t>
+      </w:r>
+    </w:p>
+    <w:p>
+      <w:pPr>
+        <w:jc w:val="both"/>
+        <w:rPr>
+          <w:b w:val="1"/>
+          <w:bCs w:val="1"/>
+        </w:rPr>
+      </w:pPr>
+      <w:r>
+        <w:rPr>
+          <w:rtl w:val="0"/>
+        </w:rPr>
       </w:r>
     </w:p>
     <w:p>
@@ -184,14 +156,14 @@
         <w:rPr/>
         <w:drawing>
           <wp:inline distB="114300" distT="114300" distL="114300" distR="114300">
-            <wp:extent cx="5819775" cy="1171575"/>
+            <wp:extent cx="5553075" cy="1143000"/>
             <wp:effectExtent b="0" l="0" r="0" t="0"/>
-            <wp:docPr id="1" name="image1.png"/>
+            <wp:docPr id="2" name="image2.png"/>
             <a:graphic>
               <a:graphicData uri="http://schemas.openxmlformats.org/drawingml/2006/picture">
                 <pic:pic>
                   <pic:nvPicPr>
-                    <pic:cNvPr id="0" name="image1.png"/>
+                    <pic:cNvPr id="0" name="image2.png"/>
                     <pic:cNvPicPr preferRelativeResize="0"/>
                   </pic:nvPicPr>
                   <pic:blipFill>
@@ -204,7 +176,7 @@
                   <pic:spPr>
                     <a:xfrm>
                       <a:off x="0" y="0"/>
-                      <a:ext cx="5819775" cy="1171575"/>
+                      <a:ext cx="5553075" cy="1143000"/>
                     </a:xfrm>
                     <a:prstGeom prst="rect"/>
                     <a:ln/>
@@ -219,85 +191,6 @@
         <w:rPr>
           <w:rtl w:val="0"/>
         </w:rPr>
-      </w:r>
-    </w:p>
-    <w:p>
-      <w:pPr>
-        <w:jc w:val="both"/>
-        <w:rPr/>
-      </w:pPr>
-      <w:r>
-        <w:rPr>
-          <w:rtl w:val="0"/>
-        </w:rPr>
-      </w:r>
-    </w:p>
-    <w:p>
-      <w:pPr>
-        <w:jc w:val="both"/>
-        <w:rPr/>
-      </w:pPr>
-      <w:r>
-        <w:rPr>
-          <w:rtl w:val="0"/>
-        </w:rPr>
-        <w:t xml:space="preserve">System calls provide an interface between user-space programs and kernel-space services. The </w:t>
-      </w:r>
-      <w:r>
-        <w:rPr>
-          <w:rFonts w:ascii="Roboto Mono" w:cs="Roboto Mono" w:eastAsia="Roboto Mono" w:hAnsi="Roboto Mono"/>
-          <w:color w:val="188038"/>
-          <w:rtl w:val="0"/>
-        </w:rPr>
-        <w:t xml:space="preserve">open()</w:t>
-      </w:r>
-      <w:r>
-        <w:rPr>
-          <w:rtl w:val="0"/>
-        </w:rPr>
-        <w:t xml:space="preserve">, </w:t>
-      </w:r>
-      <w:r>
-        <w:rPr>
-          <w:rFonts w:ascii="Roboto Mono" w:cs="Roboto Mono" w:eastAsia="Roboto Mono" w:hAnsi="Roboto Mono"/>
-          <w:color w:val="188038"/>
-          <w:rtl w:val="0"/>
-        </w:rPr>
-        <w:t xml:space="preserve">read()</w:t>
-      </w:r>
-      <w:r>
-        <w:rPr>
-          <w:rtl w:val="0"/>
-        </w:rPr>
-        <w:t xml:space="preserve">, </w:t>
-      </w:r>
-      <w:r>
-        <w:rPr>
-          <w:rFonts w:ascii="Roboto Mono" w:cs="Roboto Mono" w:eastAsia="Roboto Mono" w:hAnsi="Roboto Mono"/>
-          <w:color w:val="188038"/>
-          <w:rtl w:val="0"/>
-        </w:rPr>
-        <w:t xml:space="preserve">write()</w:t>
-      </w:r>
-      <w:r>
-        <w:rPr>
-          <w:rtl w:val="0"/>
-        </w:rPr>
-        <w:t xml:space="preserve">, and </w:t>
-      </w:r>
-      <w:r>
-        <w:rPr>
-          <w:rFonts w:ascii="Roboto Mono" w:cs="Roboto Mono" w:eastAsia="Roboto Mono" w:hAnsi="Roboto Mono"/>
-          <w:color w:val="188038"/>
-          <w:rtl w:val="0"/>
-        </w:rPr>
-        <w:t xml:space="preserve">close()</w:t>
-      </w:r>
-      <w:r>
-        <w:rPr>
-          <w:rtl w:val="0"/>
-        </w:rPr>
-        <w:t xml:space="preserve"> calls allow the program to request file operations from the kernel. </w:t>
       </w:r>
     </w:p>
     <w:sectPr>

</xml_diff>